<commit_message>
10/21 F2: outline w/ videos (6/6 picks verified), manifest, report, yield log
Co-Authored-By: Claude Opus 5.5 <noreply@anthropic.com>
Claude-Session: https://claude.ai/code/session_01VmRatYBunsoj9i1F4m2msf
</commit_message>
<xml_diff>
--- a/runs/W_10212026/10_21_OUTLINE_WED.docx
+++ b/runs/W_10212026/10_21_OUTLINE_WED.docx
@@ -57,7 +57,7 @@
         <w:t>Stage:</w:t>
       </w:r>
       <w:r>
-        <w:t xml:space="preserve"> beats</w:t>
+        <w:t xml:space="preserve"> videos</w:t>
       </w:r>
     </w:p>
     <w:p>
@@ -173,7 +173,7 @@
               <w:rPr>
                 <w:sz w:val="19"/>
               </w:rPr>
-              <w:t>The TV that watches what you watch, the rental bill with a fake photo, the call that doubles your electric rate</w:t>
+              <w:t>The TV that watches what you watch, the rental bill with a fake photo, the energy company you never signed up for</w:t>
             </w:r>
           </w:p>
         </w:tc>
@@ -271,7 +271,7 @@
               <w:rPr>
                 <w:sz w:val="19"/>
               </w:rPr>
-              <w:t>4</w:t>
+              <w:t>3/3</w:t>
             </w:r>
           </w:p>
         </w:tc>
@@ -305,7 +305,7 @@
               <w:rPr>
                 <w:sz w:val="19"/>
               </w:rPr>
-              <w:t>OmniWatch — after A beat 8 (Lon's bottom line)</w:t>
+              <w:t>OmniWatch — after A beat 7 (Lon's bottom line)</w:t>
             </w:r>
           </w:p>
         </w:tc>
@@ -403,7 +403,7 @@
               <w:rPr>
                 <w:sz w:val="19"/>
               </w:rPr>
-              <w:t>2</w:t>
+              <w:t>2/2</w:t>
             </w:r>
           </w:p>
         </w:tc>
@@ -437,7 +437,7 @@
               <w:rPr>
                 <w:sz w:val="19"/>
               </w:rPr>
-              <w:t>OmniWatch — after B beat 4 (the walkaround)</w:t>
+              <w:t>OmniWatch — after B beat 4 (your phone is your alibi)</w:t>
             </w:r>
           </w:p>
         </w:tc>
@@ -503,7 +503,7 @@
               <w:rPr>
                 <w:sz w:val="19"/>
               </w:rPr>
-              <w:t>Winter bills are going up, and this one call can double yours</w:t>
+              <w:t>Winter bills are going up, and you may have been switched to a supplier you never chose</w:t>
             </w:r>
           </w:p>
         </w:tc>
@@ -535,7 +535,7 @@
               <w:rPr>
                 <w:sz w:val="19"/>
               </w:rPr>
-              <w:t>2</w:t>
+              <w:t>1/1</w:t>
             </w:r>
           </w:p>
         </w:tc>
@@ -616,7 +616,7 @@
         <w:t>Open package:</w:t>
       </w:r>
       <w:r>
-        <w:t xml:space="preserve"> undecided (see Decisions). Recommended: the team's own footage of a TV menu with the tracking setting switched on (A beat 7), not the disputed LG audio clip.</w:t>
+        <w:t xml:space="preserve"> A beat 3, She Prepares on Walmart and LG TVs.</w:t>
       </w:r>
     </w:p>
     <w:p>
@@ -633,7 +633,7 @@
     </w:p>
     <w:p>
       <w:r>
-        <w:t>Your smart TV checks what's on its screen every few seconds and sells the pattern to advertisers, it's on by default, and only people in Texas were ever asked. A separate investigation says LG sets may record audio in standby, which LG denies, so we keep that claim separate and show you the setting that's proven on every brand. Then a rental host bills a renter for a tire with a photo of a different car, and callers ride this winter's higher bills to switch you to a supplier charging nearly double.</w:t>
+        <w:t>Your smart TV checks what's on its screen and sells the pattern to advertisers, it's on by default, and only people in Texas were ever asked. A separate investigation says LG sets can record audio in standby, which LG denies, so we keep that claim separate and lean on what's proven: the tracking, and how to turn it off where your TV lets you. Then a rental host bills a renter for a tire with a photo of a different car, and as winter bills rise, a Pennsylvania woman finds she's been signed up with an electric supplier she never heard of.</w:t>
       </w:r>
     </w:p>
     <w:p>
@@ -650,7 +650,7 @@
     </w:p>
     <w:p>
       <w:r>
-        <w:t>A climbs from your screen to the ad companies to the claim about your living room, then exhales on a fix any viewer can do with the remote. B is a quick outrage with a satisfying catch: she proved the photo was fake. C starts with a bill everyone dreads and ends on one line to check tonight, so the show exhales twice.</w:t>
+        <w:t>A climbs from your screen to the ad companies to the claim about your living room, then exhales on a fix walked through by Lon. B is a quick outrage with a satisfying catch: she proved the photo was fake. C starts with a bill everyone dreads and ends on one line to check tonight, so the show exhales twice.</w:t>
       </w:r>
     </w:p>
     <w:p>
@@ -671,7 +671,7 @@
         <w:spacing w:after="40"/>
       </w:pPr>
       <w:r>
-        <w:t>10/16 F1 collision: the pre-bible recommended the TV story as the 10/16 F1 lead, with winter bills as an F1 option. Confirm neither is running on 10/16.</w:t>
+        <w:t>Slate is final as approved (producer, 10/13). Third TV-tracking video (January ~654K, spring ~316K; Ryan says the devices video was a hit); the title has to sell a new angle (the Texas deals or the LG claim).</w:t>
       </w:r>
     </w:p>
     <w:p>
@@ -680,7 +680,7 @@
         <w:spacing w:after="40"/>
       </w:pPr>
       <w:r>
-        <w:t>Third TV-tracking video (January ~654K, spring ~316K; Ryan says the devices video was a hit). The new angles are the Texas consent deals and the LG claim; the title has to sell one of them.</w:t>
+        <w:t>No demos this show (producer, 10/13). Lon walks through where the setting usually lives (A6), and what to do when a TV doesn't have one; B and C fixes are Jeff on camera.</w:t>
       </w:r>
     </w:p>
     <w:p>
@@ -689,7 +689,7 @@
         <w:spacing w:after="40"/>
       </w:pPr>
       <w:r>
-        <w:t>Open package: the Gamers Nexus clip is the most dramatic footage but carries the disputed claim. Recommend opening on the team's menu footage (beat 7) and keeping LG to beat 6.</w:t>
+        <w:t>A: menu paths vary by model and some TVs have no off switch (producer, 10/13). Don't promise "the one setting" works on every TV; the fix leads with "check," then the brand names, then the no-setting fallback.</w:t>
       </w:r>
     </w:p>
     <w:p>
@@ -698,7 +698,7 @@
         <w:spacing w:after="40"/>
       </w:pPr>
       <w:r>
-        <w:t>A beat 7 depends on the team filming real 2026 sets. Which brands can we get? Samsung, LG, Vizio, Roku and Sony cover most homes.</w:t>
+        <w:t>A cut from 4 clips to 3 at Checkpoint 2 (producer, 10/13): no TV owner on camera, so the old A3 is gone and A is renumbered.</w:t>
       </w:r>
     </w:p>
     <w:p>
@@ -707,7 +707,7 @@
         <w:spacing w:after="40"/>
       </w:pPr>
       <w:r>
-        <w:t>Fire TV: the Amazon rule is for F1. On this F2, include Fire TV's setting or keep it out?</w:t>
+        <w:t>A5 · LEGAL: the Gamers Nexus cut carries the claim and not LG's denial. Jeff reads LG's statement right after it ("The claims made in the recently published video are not true").</w:t>
       </w:r>
     </w:p>
     <w:p>
@@ -716,7 +716,7 @@
         <w:spacing w:after="40"/>
       </w:pPr>
       <w:r>
-        <w:t>A is thin on people: beat 3 has no person yet, and beats 4 to 6 are a creator, a state and a company. Beat 3 (someone finding the setting on their own TV) is the human beat; it needs a name.</w:t>
+        <w:t>A is thin on people: A3 to A5 are a creator, a state and a researcher. Lon is the human in A.</w:t>
       </w:r>
     </w:p>
     <w:p>
@@ -725,7 +725,7 @@
         <w:spacing w:after="40"/>
       </w:pPr>
       <w:r>
-        <w:t>Lon Seidman: confirm booked, and check for sponsor or affiliate ties to TV brands or Roku before he gives settings advice.</w:t>
+        <w:t>Lon Seidman: confirm booked, and check for sponsor or affiliate ties to TV brands or Roku before he gives settings advice. On his own channel he argued Texas's LG settlement "let them off the hook."</w:t>
       </w:r>
     </w:p>
     <w:p>
@@ -734,7 +734,7 @@
         <w:spacing w:after="40"/>
       </w:pPr>
       <w:r>
-        <w:t>B: no 55+ victim, and both renters were refunded, so there's no real-loss case to lead with. It plays as a warning with a fix.</w:t>
+        <w:t>B: no 55+ victim, and Hope was refunded, so there's no real-loss case to lead with. It plays as a warning with a fix.</w:t>
       </w:r>
     </w:p>
     <w:p>
@@ -743,7 +743,7 @@
         <w:spacing w:after="40"/>
       </w:pPr>
       <w:r>
-        <w:t>B: hotel fees in or out? Recommend out (one Jeff line at most) to keep B to four beats.</w:t>
+        <w:t>B: hotel fees left out (one Jeff line at most, in Jeff should know).</w:t>
       </w:r>
     </w:p>
     <w:p>
@@ -752,7 +752,7 @@
         <w:spacing w:after="40"/>
       </w:pPr>
       <w:r>
-        <w:t>C has no 55+ victim and no clip of the call yet; beat 3 has no person. Without a find, C is Jeff, one news clip and a bill on screen.</w:t>
+        <w:t>C rewritten at Checkpoint 3 (producer, 10/13): the York County supplier-switch ("slamming") case is the story. The Rushmore "price protection" call stays as a Jeff line. The old C2 (a bill that tripled) is cut: the only finds were a 2022 summer bill and a 2023 package with no customer on camera.</w:t>
       </w:r>
     </w:p>
     <w:p>
@@ -761,7 +761,16 @@
         <w:spacing w:after="40"/>
       </w:pPr>
       <w:r>
-        <w:t>C savings guide: how much? Recommend three lines (check your supply rate, budget billing, LIHEAP), all sourced.</w:t>
+        <w:t>C savings guide: three sourced lines (check your supply rate, budget billing, LIHEAP) (producer, 10/13).</w:t>
+      </w:r>
+    </w:p>
+    <w:p>
+      <w:pPr>
+        <w:pStyle w:val="ListBullet"/>
+        <w:spacing w:after="40"/>
+      </w:pPr>
+      <w:r>
+        <w:t>Picks: 6/6 verified against YouTube captions (rung 1). Source mix: affiliate 3 · creator_long 3.</w:t>
       </w:r>
     </w:p>
     <w:p>
@@ -789,7 +798,7 @@
         <w:t>In one sentence:</w:t>
       </w:r>
       <w:r>
-        <w:t xml:space="preserve"> Smart TVs check what's on screen every few seconds and sell that data to advertisers, it's on by default, only Texans got asked, and one setting turns it off.</w:t>
+        <w:t xml:space="preserve"> Smart TVs check what's on screen and sell that data to advertisers, it's on by default, only Texans got asked, and on most sets you can switch it off.</w:t>
       </w:r>
     </w:p>
     <w:p>
@@ -811,7 +820,7 @@
         <w:t>Peg:</w:t>
       </w:r>
       <w:r>
-        <w:t xml:space="preserve"> Texas forced Samsung (Feb 2026) and LG (May 2026) to ask before tracking → but only in Texas → everyone else is still opted in and was never asked. "Texas got asked. You didn't." Plus the Gamers Nexus investigation (Sept 7) that put TV spying back in the news.</w:t>
+        <w:t xml:space="preserve"> Texas forced Samsung (Feb 2026) and LG (May 2026) to ask before tracking → but only in Texas → everyone else is still opted in and was never asked. "Texas got asked. You didn't." Plus the Gamers Nexus investigation (Sept 6) that put TV spying back in the news.</w:t>
       </w:r>
     </w:p>
     <w:p>
@@ -844,7 +853,7 @@
         <w:t>Weight:</w:t>
       </w:r>
       <w:r>
-        <w:t xml:space="preserve"> ~55% of show · 4 clip beats</w:t>
+        <w:t xml:space="preserve"> ~55% of show · 3 clip beats</w:t>
       </w:r>
     </w:p>
     <w:tbl>
@@ -1127,88 +1136,6 @@
               <w:rPr>
                 <w:sz w:val="19"/>
               </w:rPr>
-              <w:t>She finds it on</w:t>
-            </w:r>
-          </w:p>
-        </w:tc>
-        <w:tc>
-          <w:tcPr>
-            <w:tcW w:type="dxa" w:w="2160"/>
-          </w:tcPr>
-          <w:p>
-            <w:pPr>
-              <w:spacing w:after="40"/>
-            </w:pPr>
-            <w:r>
-              <w:rPr>
-                <w:sz w:val="19"/>
-              </w:rPr>
-              <w:t>Unnamed — need a name (TV owner, 2026)</w:t>
-            </w:r>
-          </w:p>
-        </w:tc>
-        <w:tc>
-          <w:tcPr>
-            <w:tcW w:type="dxa" w:w="4104"/>
-          </w:tcPr>
-          <w:p>
-            <w:pPr>
-              <w:spacing w:after="40"/>
-            </w:pPr>
-            <w:r>
-              <w:rPr>
-                <w:sz w:val="19"/>
-              </w:rPr>
-              <w:t>A TV owner opens her settings on camera and finds the tracking switched on.</w:t>
-            </w:r>
-          </w:p>
-        </w:tc>
-        <w:tc>
-          <w:tcPr>
-            <w:tcW w:type="dxa" w:w="1584"/>
-          </w:tcPr>
-          <w:p>
-            <w:pPr>
-              <w:spacing w:after="40"/>
-            </w:pPr>
-            <w:r>
-              <w:rPr>
-                <w:sz w:val="19"/>
-              </w:rPr>
-              <w:t>FIND · VERTICAL — TikTok/Reels of an owner finding ACR on</w:t>
-            </w:r>
-          </w:p>
-        </w:tc>
-      </w:tr>
-      <w:tr>
-        <w:tc>
-          <w:tcPr>
-            <w:tcW w:type="dxa" w:w="432"/>
-          </w:tcPr>
-          <w:p>
-            <w:pPr>
-              <w:spacing w:after="40"/>
-            </w:pPr>
-            <w:r>
-              <w:rPr>
-                <w:sz w:val="19"/>
-              </w:rPr>
-              <w:t>4</w:t>
-            </w:r>
-          </w:p>
-        </w:tc>
-        <w:tc>
-          <w:tcPr>
-            <w:tcW w:type="dxa" w:w="1656"/>
-          </w:tcPr>
-          <w:p>
-            <w:pPr>
-              <w:spacing w:after="40"/>
-            </w:pPr>
-            <w:r>
-              <w:rPr>
-                <w:sz w:val="19"/>
-              </w:rPr>
               <w:t>Who's buying</w:t>
             </w:r>
           </w:p>
@@ -1241,7 +1168,7 @@
               <w:rPr>
                 <w:sz w:val="19"/>
               </w:rPr>
-              <w:t>Her video on Walmart and LG TVs and the ad business behind the screen.</w:t>
+              <w:t>Vizio's own policy: what you watch is licensed to partners and tied to your age, location and purchases; Walmart bought Vizio for the ads.</w:t>
             </w:r>
           </w:p>
         </w:tc>
@@ -1275,7 +1202,7 @@
               <w:rPr>
                 <w:sz w:val="19"/>
               </w:rPr>
-              <w:t>5</w:t>
+              <w:t>4</w:t>
             </w:r>
           </w:p>
         </w:tc>
@@ -1357,7 +1284,7 @@
               <w:rPr>
                 <w:sz w:val="19"/>
               </w:rPr>
-              <w:t>6</w:t>
+              <w:t>5</w:t>
             </w:r>
           </w:p>
         </w:tc>
@@ -1405,7 +1332,7 @@
               <w:rPr>
                 <w:sz w:val="19"/>
               </w:rPr>
-              <w:t>His investigation alleges LG sets recorded room audio in standby; LG says the claims are not true.</w:t>
+              <w:t>His team captured microphone audio from an LG TV that looked off and was unplugged from the network; LG says the claims are not true.</w:t>
             </w:r>
           </w:p>
         </w:tc>
@@ -1439,7 +1366,7 @@
               <w:rPr>
                 <w:sz w:val="19"/>
               </w:rPr>
-              <w:t>7</w:t>
+              <w:t>6</w:t>
             </w:r>
           </w:p>
         </w:tc>
@@ -1455,7 +1382,7 @@
               <w:rPr>
                 <w:sz w:val="19"/>
               </w:rPr>
-              <w:t>Turn it off, brand by brand</w:t>
+              <w:t>Turn it off, if you can</w:t>
             </w:r>
           </w:p>
         </w:tc>
@@ -1471,7 +1398,7 @@
               <w:rPr>
                 <w:sz w:val="19"/>
               </w:rPr>
-              <w:t>You (the viewer)</w:t>
+              <w:t>Lon Seidman</w:t>
             </w:r>
           </w:p>
         </w:tc>
@@ -1487,7 +1414,7 @@
               <w:rPr>
                 <w:sz w:val="19"/>
               </w:rPr>
-              <w:t>The team films the menus on real sets; Jeff narrates the path for Samsung, LG, Vizio, Roku and Sony.</w:t>
+              <w:t>Where the setting usually lives on Samsung, LG, Vizio, Roku and Sony, over a graphic, and what to do when your TV has none.</w:t>
             </w:r>
           </w:p>
         </w:tc>
@@ -1503,7 +1430,7 @@
               <w:rPr>
                 <w:sz w:val="19"/>
               </w:rPr>
-              <w:t>DEMO</w:t>
+              <w:t>GUEST</w:t>
             </w:r>
           </w:p>
         </w:tc>
@@ -1521,7 +1448,7 @@
               <w:rPr>
                 <w:sz w:val="19"/>
               </w:rPr>
-              <w:t>8</w:t>
+              <w:t>7</w:t>
             </w:r>
           </w:p>
         </w:tc>
@@ -1601,6 +1528,362 @@
           <w:color w:val="333333"/>
           <w:sz w:val="22"/>
         </w:rPr>
+        <w:t>Videos</w:t>
+      </w:r>
+    </w:p>
+    <w:tbl>
+      <w:tblPr>
+        <w:tblStyle w:val="TableGrid"/>
+        <w:tblW w:type="auto" w:w="0"/>
+        <w:jc w:val="center"/>
+        <w:tblLayout w:type="fixed"/>
+        <w:tblLook w:firstColumn="1" w:firstRow="1" w:lastColumn="0" w:lastRow="0" w:noHBand="0" w:noVBand="1" w:val="04A0"/>
+      </w:tblPr>
+      <w:tblGrid>
+        <w:gridCol w:w="432"/>
+        <w:gridCol w:w="2664"/>
+        <w:gridCol w:w="3096"/>
+        <w:gridCol w:w="2376"/>
+        <w:gridCol w:w="1368"/>
+      </w:tblGrid>
+      <w:tr>
+        <w:tc>
+          <w:tcPr>
+            <w:tcW w:type="dxa" w:w="432"/>
+          </w:tcPr>
+          <w:p>
+            <w:r>
+              <w:rPr>
+                <w:b/>
+                <w:sz w:val="19"/>
+              </w:rPr>
+              <w:t>#</w:t>
+            </w:r>
+          </w:p>
+        </w:tc>
+        <w:tc>
+          <w:tcPr>
+            <w:tcW w:type="dxa" w:w="2664"/>
+          </w:tcPr>
+          <w:p>
+            <w:r>
+              <w:rPr>
+                <w:b/>
+                <w:sz w:val="19"/>
+              </w:rPr>
+              <w:t>Clip</w:t>
+            </w:r>
+          </w:p>
+        </w:tc>
+        <w:tc>
+          <w:tcPr>
+            <w:tcW w:type="dxa" w:w="3096"/>
+          </w:tcPr>
+          <w:p>
+            <w:r>
+              <w:rPr>
+                <w:b/>
+                <w:sz w:val="19"/>
+              </w:rPr>
+              <w:t>Shows</w:t>
+            </w:r>
+          </w:p>
+        </w:tc>
+        <w:tc>
+          <w:tcPr>
+            <w:tcW w:type="dxa" w:w="2376"/>
+          </w:tcPr>
+          <w:p>
+            <w:r>
+              <w:rPr>
+                <w:b/>
+                <w:sz w:val="19"/>
+              </w:rPr>
+              <w:t>In–Out</w:t>
+            </w:r>
+          </w:p>
+        </w:tc>
+        <w:tc>
+          <w:tcPr>
+            <w:tcW w:type="dxa" w:w="1368"/>
+          </w:tcPr>
+          <w:p>
+            <w:r>
+              <w:rPr>
+                <w:b/>
+                <w:sz w:val="19"/>
+              </w:rPr>
+              <w:t>Status</w:t>
+            </w:r>
+          </w:p>
+        </w:tc>
+      </w:tr>
+      <w:tr>
+        <w:tc>
+          <w:tcPr>
+            <w:tcW w:type="dxa" w:w="432"/>
+          </w:tcPr>
+          <w:p>
+            <w:pPr>
+              <w:spacing w:after="40"/>
+            </w:pPr>
+            <w:r>
+              <w:rPr>
+                <w:sz w:val="19"/>
+              </w:rPr>
+              <w:t>3</w:t>
+            </w:r>
+          </w:p>
+        </w:tc>
+        <w:tc>
+          <w:tcPr>
+            <w:tcW w:type="dxa" w:w="2664"/>
+          </w:tcPr>
+          <w:p>
+            <w:pPr>
+              <w:spacing w:after="40"/>
+            </w:pPr>
+            <w:hyperlink r:id="rId9">
+              <w:r>
+                <w:rPr>
+                  <w:color w:val="1155CC"/>
+                  <w:u w:val="single"/>
+                </w:rPr>
+                <w:t xml:space="preserve">She Prepares — What Walmart TVs and LG Are Really Doing When Inside Your Home...</w:t>
+              </w:r>
+            </w:hyperlink>
+          </w:p>
+        </w:tc>
+        <w:tc>
+          <w:tcPr>
+            <w:tcW w:type="dxa" w:w="3096"/>
+          </w:tcPr>
+          <w:p>
+            <w:pPr>
+              <w:spacing w:after="40"/>
+            </w:pPr>
+            <w:r>
+              <w:rPr>
+                <w:sz w:val="19"/>
+              </w:rPr>
+              <w:t>She reads Vizio's privacy policy in plain words (viewing data licensed to partners, combined with age, location and purchases), then why Walmart bought Vizio: the ad business. Uploaded Oct 3, 2026, 12:46, 1.23M views.</w:t>
+            </w:r>
+          </w:p>
+        </w:tc>
+        <w:tc>
+          <w:tcPr>
+            <w:tcW w:type="dxa" w:w="2376"/>
+          </w:tcPr>
+          <w:p>
+            <w:pPr>
+              <w:spacing w:after="40"/>
+            </w:pPr>
+            <w:r>
+              <w:rPr>
+                <w:sz w:val="19"/>
+              </w:rPr>
+              <w:t>8:13–9:13 "what you buy" BUTT 10:02–10:33 "gives them to you"</w:t>
+            </w:r>
+          </w:p>
+        </w:tc>
+        <w:tc>
+          <w:tcPr>
+            <w:tcW w:type="dxa" w:w="1368"/>
+          </w:tcPr>
+          <w:p>
+            <w:pPr>
+              <w:spacing w:after="40"/>
+            </w:pPr>
+            <w:r>
+              <w:rPr>
+                <w:sz w:val="19"/>
+              </w:rPr>
+              <w:t>PICK</w:t>
+            </w:r>
+          </w:p>
+        </w:tc>
+      </w:tr>
+      <w:tr>
+        <w:tc>
+          <w:tcPr>
+            <w:tcW w:type="dxa" w:w="432"/>
+          </w:tcPr>
+          <w:p>
+            <w:pPr>
+              <w:spacing w:after="40"/>
+            </w:pPr>
+            <w:r>
+              <w:rPr>
+                <w:sz w:val="19"/>
+              </w:rPr>
+              <w:t>4</w:t>
+            </w:r>
+          </w:p>
+        </w:tc>
+        <w:tc>
+          <w:tcPr>
+            <w:tcW w:type="dxa" w:w="2664"/>
+          </w:tcPr>
+          <w:p>
+            <w:pPr>
+              <w:spacing w:after="40"/>
+            </w:pPr>
+            <w:hyperlink r:id="rId10">
+              <w:r>
+                <w:rPr>
+                  <w:color w:val="1155CC"/>
+                  <w:u w:val="single"/>
+                </w:rPr>
+                <w:t xml:space="preserve">KVUE — Texas reaches settlement with LG in smart TV privacy lawsuit</w:t>
+              </w:r>
+            </w:hyperlink>
+          </w:p>
+        </w:tc>
+        <w:tc>
+          <w:tcPr>
+            <w:tcW w:type="dxa" w:w="3096"/>
+          </w:tcPr>
+          <w:p>
+            <w:pPr>
+              <w:spacing w:after="40"/>
+            </w:pPr>
+            <w:r>
+              <w:rPr>
+                <w:sz w:val="19"/>
+              </w:rPr>
+              <w:t>Paxton's LG settlement requires a pop-up and an opt-out; LG admits no wrongdoing; Samsung also settled; Sony, Hisense and TCL cases ongoing. Uploaded May 11, 2026, 1:18.</w:t>
+            </w:r>
+          </w:p>
+        </w:tc>
+        <w:tc>
+          <w:tcPr>
+            <w:tcW w:type="dxa" w:w="2376"/>
+          </w:tcPr>
+          <w:p>
+            <w:pPr>
+              <w:spacing w:after="40"/>
+            </w:pPr>
+            <w:r>
+              <w:rPr>
+                <w:sz w:val="19"/>
+              </w:rPr>
+              <w:t>0:00–0:49 "under this agreement" BUTT 1:08–1:16 "are still ongoing"</w:t>
+            </w:r>
+          </w:p>
+        </w:tc>
+        <w:tc>
+          <w:tcPr>
+            <w:tcW w:type="dxa" w:w="1368"/>
+          </w:tcPr>
+          <w:p>
+            <w:pPr>
+              <w:spacing w:after="40"/>
+            </w:pPr>
+            <w:r>
+              <w:rPr>
+                <w:sz w:val="19"/>
+              </w:rPr>
+              <w:t>PICK</w:t>
+            </w:r>
+          </w:p>
+        </w:tc>
+      </w:tr>
+      <w:tr>
+        <w:tc>
+          <w:tcPr>
+            <w:tcW w:type="dxa" w:w="432"/>
+          </w:tcPr>
+          <w:p>
+            <w:pPr>
+              <w:spacing w:after="40"/>
+            </w:pPr>
+            <w:r>
+              <w:rPr>
+                <w:sz w:val="19"/>
+              </w:rPr>
+              <w:t>5</w:t>
+            </w:r>
+          </w:p>
+        </w:tc>
+        <w:tc>
+          <w:tcPr>
+            <w:tcW w:type="dxa" w:w="2664"/>
+          </w:tcPr>
+          <w:p>
+            <w:pPr>
+              <w:spacing w:after="40"/>
+            </w:pPr>
+            <w:hyperlink r:id="rId11">
+              <w:r>
+                <w:rPr>
+                  <w:color w:val="1155CC"/>
+                  <w:u w:val="single"/>
+                </w:rPr>
+                <w:t xml:space="preserve">Gamers Nexus — 216,000,000 Spy TVs: The LG Smart TV Problem</w:t>
+              </w:r>
+            </w:hyperlink>
+          </w:p>
+        </w:tc>
+        <w:tc>
+          <w:tcPr>
+            <w:tcW w:type="dxa" w:w="3096"/>
+          </w:tcPr>
+          <w:p>
+            <w:pPr>
+              <w:spacing w:after="40"/>
+            </w:pPr>
+            <w:r>
+              <w:rPr>
+                <w:sz w:val="19"/>
+              </w:rPr>
+              <w:t>Steve Burke: microphone audio captured while the TV appeared off and unplugged, stored and pulled out "by someone with remote access" through vulnerabilities. LG's denial is not in this window. Uploaded Sept 6, 2026, 2:15:52, 8.2M views.</w:t>
+            </w:r>
+          </w:p>
+        </w:tc>
+        <w:tc>
+          <w:tcPr>
+            <w:tcW w:type="dxa" w:w="2376"/>
+          </w:tcPr>
+          <w:p>
+            <w:pPr>
+              <w:spacing w:after="40"/>
+            </w:pPr>
+            <w:r>
+              <w:rPr>
+                <w:sz w:val="19"/>
+              </w:rPr>
+              <w:t>0:26–0:52 "user reconnected the network"</w:t>
+            </w:r>
+          </w:p>
+        </w:tc>
+        <w:tc>
+          <w:tcPr>
+            <w:tcW w:type="dxa" w:w="1368"/>
+          </w:tcPr>
+          <w:p>
+            <w:pPr>
+              <w:spacing w:after="40"/>
+            </w:pPr>
+            <w:r>
+              <w:rPr>
+                <w:sz w:val="19"/>
+              </w:rPr>
+              <w:t>PICK · LEGAL</w:t>
+            </w:r>
+          </w:p>
+        </w:tc>
+      </w:tr>
+    </w:tbl>
+    <w:p/>
+    <w:p>
+      <w:pPr>
+        <w:pStyle w:val="Heading3"/>
+      </w:pPr>
+      <w:r>
+        <w:rPr>
+          <w:color w:val="333333"/>
+          <w:sz w:val="22"/>
+        </w:rPr>
         <w:t>The fix</w:t>
       </w:r>
     </w:p>
@@ -1610,7 +1893,7 @@
         <w:spacing w:after="40"/>
       </w:pPr>
       <w:r>
-        <w:t>After Lon (beat 2): an ad for something you just watched on another channel is ACR at work.</w:t>
+        <w:t>After She Prepares (beat 3): if your TV asked you to "agree" to anything at setup, assume the tracking is on.</w:t>
       </w:r>
     </w:p>
     <w:p>
@@ -1619,7 +1902,7 @@
         <w:spacing w:after="40"/>
       </w:pPr>
       <w:r>
-        <w:t>After She Prepares (beat 4): if your TV asked you to "agree" to anything at setup, assume the tracking is on.</w:t>
+        <w:t>After Texas (beat 4): you're not in Texas, so nobody is going to ask you. Check it yourself.</w:t>
       </w:r>
     </w:p>
     <w:p>
@@ -1628,7 +1911,7 @@
         <w:spacing w:after="40"/>
       </w:pPr>
       <w:r>
-        <w:t>After Gamers Nexus (beat 6): don't wait for the listening claim to be settled; turn off what's proven.</w:t>
+        <w:t>After Gamers Nexus (beat 5): don't wait for the listening claim to be settled; turn off what's proven.</w:t>
       </w:r>
     </w:p>
     <w:p>
@@ -1637,7 +1920,7 @@
         <w:spacing w:after="40"/>
       </w:pPr>
       <w:r>
-        <w:t>Samsung: Viewing Information Services, off (Consumer Reports, how to turn off smart TV snooping, updated 10/19/2025). ⚠️ verify on a 2026 set.</w:t>
+        <w:t>Look in privacy or viewing settings first; the names below are where it usually lives, and they vary by model. ⚠️ verify on 2026 sets</w:t>
       </w:r>
     </w:p>
     <w:p>
@@ -1646,7 +1929,7 @@
         <w:spacing w:after="40"/>
       </w:pPr>
       <w:r>
-        <w:t>LG: Viewing Information (Live Plus), off (Consumer Reports). ⚠️ verify on a 2026 set.</w:t>
+        <w:t>Samsung: Viewing Information Services, off (Consumer Reports, how to turn off smart TV snooping, updated 10/19/2025).</w:t>
       </w:r>
     </w:p>
     <w:p>
@@ -1655,7 +1938,7 @@
         <w:spacing w:after="40"/>
       </w:pPr>
       <w:r>
-        <w:t>Vizio: Viewing Data, off (Consumer Reports). ⚠️ verify on a 2026 set.</w:t>
+        <w:t>LG: Viewing Information (Live Plus), off (Consumer Reports).</w:t>
       </w:r>
     </w:p>
     <w:p>
@@ -1664,7 +1947,7 @@
         <w:spacing w:after="40"/>
       </w:pPr>
       <w:r>
-        <w:t>Roku TVs: Use Info from TV Inputs, off (Consumer Reports). ⚠️ verify on a 2026 set.</w:t>
+        <w:t>Vizio: Viewing Data, off (Consumer Reports). Vizio says turning it off won't affect how the TV works (Vizio privacy policy, per She Prepares, 9:14).</w:t>
       </w:r>
     </w:p>
     <w:p>
@@ -1673,7 +1956,7 @@
         <w:spacing w:after="40"/>
       </w:pPr>
       <w:r>
-        <w:t>Sony: Samba Interactive TV, off (Consumer Reports). ⚠️ verify on a 2026 set.</w:t>
+        <w:t>Roku TVs: Use Info from TV Inputs, off (Consumer Reports).</w:t>
       </w:r>
     </w:p>
     <w:p>
@@ -1682,7 +1965,7 @@
         <w:spacing w:after="40"/>
       </w:pPr>
       <w:r>
-        <w:t>Microphone: Roku, Microphone Access to Never Allow; Samsung's physical mic switch. ⚠️ unsourced, verify on the sets.</w:t>
+        <w:t>Sony: Samba Interactive TV, off (Consumer Reports).</w:t>
       </w:r>
     </w:p>
     <w:p>
@@ -1691,7 +1974,25 @@
         <w:spacing w:after="40"/>
       </w:pPr>
       <w:r>
-        <w:t>Do-nothing test: do nothing and the tracking stays on; turning it off doesn't break the TV (Consumer Reports). ⚠️ Check whether a software update or factory reset turns it back on; if so, add "check again after updates."</w:t>
+        <w:t>No setting on your TV? ⚠️ Lon to confirm the fallback (e.g. take the TV off Wi-Fi and use a streaming device); unsourced.</w:t>
+      </w:r>
+    </w:p>
+    <w:p>
+      <w:pPr>
+        <w:pStyle w:val="ListBullet"/>
+        <w:spacing w:after="40"/>
+      </w:pPr>
+      <w:r>
+        <w:t>Microphone: Roku, Microphone Access to Never Allow; Samsung's physical mic switch. ⚠️ unsourced, Lon to confirm.</w:t>
+      </w:r>
+    </w:p>
+    <w:p>
+      <w:pPr>
+        <w:pStyle w:val="ListBullet"/>
+        <w:spacing w:after="40"/>
+      </w:pPr>
+      <w:r>
+        <w:t>Do-nothing test: do nothing and the tracking stays on. Opting out did stop data going to the tracking servers in one study's tests (cited by She Prepares, 6:27). ⚠️ Check whether a software update or factory reset turns it back on.</w:t>
       </w:r>
     </w:p>
     <w:p>
@@ -1721,16 +2022,7 @@
         <w:spacing w:after="40"/>
       </w:pPr>
       <w:r>
-        <w:t>⚠️ Beat 3: no person yet. If the search comes back empty, beat 3 folds into Jeff and the demo.</w:t>
-      </w:r>
-    </w:p>
-    <w:p>
-      <w:pPr>
-        <w:pStyle w:val="ListBullet"/>
-        <w:spacing w:after="40"/>
-      </w:pPr>
-      <w:r>
-        <w:t>⚠️ Beat 5: the Texas suits are Dec 2025 and Samsung's deal Feb 2026, more than six months before airdate. Date them on air ("last December," "in February").</w:t>
+        <w:t>⚠️ Beat 4: the Texas suits are Dec 2025 and Samsung's deal Feb 2026, more than six months before airdate. Date them on air ("last December," "in February").</w:t>
       </w:r>
     </w:p>
     <w:p>
@@ -1748,16 +2040,7 @@
         <w:spacing w:after="40"/>
       </w:pPr>
       <w:r>
-        <w:t>⚠️ Beat 4: She Prepares' content is known from its title only; what it says about Walmart and LG is unconfirmed until the transcript.</w:t>
-      </w:r>
-    </w:p>
-    <w:p>
-      <w:pPr>
-        <w:pStyle w:val="ListBullet"/>
-        <w:spacing w:after="40"/>
-      </w:pPr>
-      <w:r>
-        <w:t>⚠️ Beats 4 and 6 are creator videos, so they need clearance. No local news clip on this story is over 200K.</w:t>
+        <w:t>⚠️ Beats 3 and 5 are creator videos and need clearance.</w:t>
       </w:r>
     </w:p>
     <w:p>
@@ -1778,7 +2061,7 @@
         <w:spacing w:after="40"/>
       </w:pPr>
       <w:r>
-        <w:t>Beat 6: LG says the claims "are not true," and nothing independent has confirmed them. Never say "LG is listening"; say "the investigation alleges." Gamers Nexus also posted a follow-up, "LG Says We're Fake News" (~3.9M).</w:t>
+        <w:t>Beat 5: LG says the claims "are not true," and nothing independent has confirmed them. Never say "LG is listening"; say "the investigation found" or "alleges." In Gamers Nexus's demo, the recording was retrieved "by someone with remote access" through vulnerabilities; it does not show LG collecting audio.</w:t>
       </w:r>
     </w:p>
     <w:p>
@@ -1787,7 +2070,7 @@
         <w:spacing w:after="40"/>
       </w:pPr>
       <w:r>
-        <w:t>Beat 5: the Texas deals cover Texans only. Viewers elsewhere have to switch the setting off themselves.</w:t>
+        <w:t>Beat 5: LG told She Prepares' source that in standby the TV only listens for a wake word if far-field voice is turned on, and that audio is deleted and never sent (She Prepares, 4:31).</w:t>
       </w:r>
     </w:p>
     <w:p>
@@ -1796,7 +2079,16 @@
         <w:spacing w:after="40"/>
       </w:pPr>
       <w:r>
-        <w:t>Beat 4: the 49 million US LG TVs figure is LG Ad Solutions' own number.</w:t>
+        <w:t>Beat 4: the Texas deals cover Texans only. The KVUE window includes a line about transfers to the Chinese Communist Party (0:36–0:42).</w:t>
+      </w:r>
+    </w:p>
+    <w:p>
+      <w:pPr>
+        <w:pStyle w:val="ListBullet"/>
+        <w:spacing w:after="40"/>
+      </w:pPr>
+      <w:r>
+        <w:t>Beat 3: Vizio says some "activity data" is still collected even with viewing data off, unless you turn it off at setup or reset the TV (She Prepares, 9:29).</w:t>
       </w:r>
     </w:p>
     <w:p>
@@ -1814,7 +2106,7 @@
         <w:spacing w:after="40"/>
       </w:pPr>
       <w:r>
-        <w:t>Beat 7: Fire TV is out unless the room says otherwise (see Decisions).</w:t>
+        <w:t>Beat 6: Fire TV left out of the brand list (it's an Amazon device); add it only if the room asks.</w:t>
       </w:r>
     </w:p>
     <w:p>
@@ -2294,7 +2586,7 @@
               <w:rPr>
                 <w:sz w:val="19"/>
               </w:rPr>
-              <w:t>Jeff films a slow walkaround of a rental, tires and interior, and runs a damage photo through a reverse image search.</w:t>
+              <w:t>Before you drive off, film a slow walkaround, tires and interior; if they send a damage photo, reverse-image-search it.</w:t>
             </w:r>
           </w:p>
         </w:tc>
@@ -2310,7 +2602,278 @@
               <w:rPr>
                 <w:sz w:val="19"/>
               </w:rPr>
-              <w:t>DEMO</w:t>
+              <w:t>JEFF</w:t>
+            </w:r>
+          </w:p>
+        </w:tc>
+      </w:tr>
+    </w:tbl>
+    <w:p/>
+    <w:p>
+      <w:pPr>
+        <w:pStyle w:val="Heading3"/>
+      </w:pPr>
+      <w:r>
+        <w:rPr>
+          <w:color w:val="333333"/>
+          <w:sz w:val="22"/>
+        </w:rPr>
+        <w:t>Videos</w:t>
+      </w:r>
+    </w:p>
+    <w:tbl>
+      <w:tblPr>
+        <w:tblStyle w:val="TableGrid"/>
+        <w:tblW w:type="auto" w:w="0"/>
+        <w:jc w:val="center"/>
+        <w:tblLayout w:type="fixed"/>
+        <w:tblLook w:firstColumn="1" w:firstRow="1" w:lastColumn="0" w:lastRow="0" w:noHBand="0" w:noVBand="1" w:val="04A0"/>
+      </w:tblPr>
+      <w:tblGrid>
+        <w:gridCol w:w="432"/>
+        <w:gridCol w:w="2664"/>
+        <w:gridCol w:w="3096"/>
+        <w:gridCol w:w="2376"/>
+        <w:gridCol w:w="1368"/>
+      </w:tblGrid>
+      <w:tr>
+        <w:tc>
+          <w:tcPr>
+            <w:tcW w:type="dxa" w:w="432"/>
+          </w:tcPr>
+          <w:p>
+            <w:r>
+              <w:rPr>
+                <w:b/>
+                <w:sz w:val="19"/>
+              </w:rPr>
+              <w:t>#</w:t>
+            </w:r>
+          </w:p>
+        </w:tc>
+        <w:tc>
+          <w:tcPr>
+            <w:tcW w:type="dxa" w:w="2664"/>
+          </w:tcPr>
+          <w:p>
+            <w:r>
+              <w:rPr>
+                <w:b/>
+                <w:sz w:val="19"/>
+              </w:rPr>
+              <w:t>Clip</w:t>
+            </w:r>
+          </w:p>
+        </w:tc>
+        <w:tc>
+          <w:tcPr>
+            <w:tcW w:type="dxa" w:w="3096"/>
+          </w:tcPr>
+          <w:p>
+            <w:r>
+              <w:rPr>
+                <w:b/>
+                <w:sz w:val="19"/>
+              </w:rPr>
+              <w:t>Shows</w:t>
+            </w:r>
+          </w:p>
+        </w:tc>
+        <w:tc>
+          <w:tcPr>
+            <w:tcW w:type="dxa" w:w="2376"/>
+          </w:tcPr>
+          <w:p>
+            <w:r>
+              <w:rPr>
+                <w:b/>
+                <w:sz w:val="19"/>
+              </w:rPr>
+              <w:t>In–Out</w:t>
+            </w:r>
+          </w:p>
+        </w:tc>
+        <w:tc>
+          <w:tcPr>
+            <w:tcW w:type="dxa" w:w="1368"/>
+          </w:tcPr>
+          <w:p>
+            <w:r>
+              <w:rPr>
+                <w:b/>
+                <w:sz w:val="19"/>
+              </w:rPr>
+              <w:t>Status</w:t>
+            </w:r>
+          </w:p>
+        </w:tc>
+      </w:tr>
+      <w:tr>
+        <w:tc>
+          <w:tcPr>
+            <w:tcW w:type="dxa" w:w="432"/>
+          </w:tcPr>
+          <w:p>
+            <w:pPr>
+              <w:spacing w:after="40"/>
+            </w:pPr>
+            <w:r>
+              <w:rPr>
+                <w:sz w:val="19"/>
+              </w:rPr>
+              <w:t>1</w:t>
+            </w:r>
+          </w:p>
+        </w:tc>
+        <w:tc>
+          <w:tcPr>
+            <w:tcW w:type="dxa" w:w="2664"/>
+          </w:tcPr>
+          <w:p>
+            <w:pPr>
+              <w:spacing w:after="40"/>
+            </w:pPr>
+            <w:hyperlink r:id="rId12">
+              <w:r>
+                <w:rPr>
+                  <w:color w:val="1155CC"/>
+                  <w:u w:val="single"/>
+                </w:rPr>
+                <w:t xml:space="preserve">KSL Get Gephardt — Car rental service attempts to scam Utah woman out of hundreds</w:t>
+              </w:r>
+            </w:hyperlink>
+          </w:p>
+        </w:tc>
+        <w:tc>
+          <w:tcPr>
+            <w:tcW w:type="dxa" w:w="3096"/>
+          </w:tcPr>
+          <w:p>
+            <w:pPr>
+              <w:spacing w:after="40"/>
+            </w:pPr>
+            <w:r>
+              <w:rPr>
+                <w:sz w:val="19"/>
+              </w:rPr>
+              <w:t>Hope Orr: a claim for a nail in the tire and smoking ("I don't smoke"), the host's evidence photos, Turo posts a $500 charge. Uploaded Oct 6, 2026, 4:35, 609K views.</w:t>
+            </w:r>
+          </w:p>
+        </w:tc>
+        <w:tc>
+          <w:tcPr>
+            <w:tcW w:type="dxa" w:w="2376"/>
+          </w:tcPr>
+          <w:p>
+            <w:pPr>
+              <w:spacing w:after="40"/>
+            </w:pPr>
+            <w:r>
+              <w:rPr>
+                <w:sz w:val="19"/>
+              </w:rPr>
+              <w:t>0:49–1:38 "actually going to cost me"</w:t>
+            </w:r>
+          </w:p>
+        </w:tc>
+        <w:tc>
+          <w:tcPr>
+            <w:tcW w:type="dxa" w:w="1368"/>
+          </w:tcPr>
+          <w:p>
+            <w:pPr>
+              <w:spacing w:after="40"/>
+            </w:pPr>
+            <w:r>
+              <w:rPr>
+                <w:sz w:val="19"/>
+              </w:rPr>
+              <w:t>PICK</w:t>
+            </w:r>
+          </w:p>
+        </w:tc>
+      </w:tr>
+      <w:tr>
+        <w:tc>
+          <w:tcPr>
+            <w:tcW w:type="dxa" w:w="432"/>
+          </w:tcPr>
+          <w:p>
+            <w:pPr>
+              <w:spacing w:after="40"/>
+            </w:pPr>
+            <w:r>
+              <w:rPr>
+                <w:sz w:val="19"/>
+              </w:rPr>
+              <w:t>2</w:t>
+            </w:r>
+          </w:p>
+        </w:tc>
+        <w:tc>
+          <w:tcPr>
+            <w:tcW w:type="dxa" w:w="2664"/>
+          </w:tcPr>
+          <w:p>
+            <w:pPr>
+              <w:spacing w:after="40"/>
+            </w:pPr>
+            <w:hyperlink r:id="rId12">
+              <w:r>
+                <w:rPr>
+                  <w:color w:val="1155CC"/>
+                  <w:u w:val="single"/>
+                </w:rPr>
+                <w:t xml:space="preserve">KSL Get Gephardt — same clip</w:t>
+              </w:r>
+            </w:hyperlink>
+          </w:p>
+        </w:tc>
+        <w:tc>
+          <w:tcPr>
+            <w:tcW w:type="dxa" w:w="3096"/>
+          </w:tcPr>
+          <w:p>
+            <w:pPr>
+              <w:spacing w:after="40"/>
+            </w:pPr>
+            <w:r>
+              <w:rPr>
+                <w:sz w:val="19"/>
+              </w:rPr>
+              <w:t>The host's "I've done more than 5,000 tire claims," the mismatched tread, Turo sides with the host, then the reverse image search finds the photo in a Reddit post "from 4 years ago" and Turo drops the claims.</w:t>
+            </w:r>
+          </w:p>
+        </w:tc>
+        <w:tc>
+          <w:tcPr>
+            <w:tcW w:type="dxa" w:w="2376"/>
+          </w:tcPr>
+          <w:p>
+            <w:pPr>
+              <w:spacing w:after="40"/>
+            </w:pPr>
+            <w:r>
+              <w:rPr>
+                <w:sz w:val="19"/>
+              </w:rPr>
+              <w:t>1:40–2:51 "removed the bogus claims"</w:t>
+            </w:r>
+          </w:p>
+        </w:tc>
+        <w:tc>
+          <w:tcPr>
+            <w:tcW w:type="dxa" w:w="1368"/>
+          </w:tcPr>
+          <w:p>
+            <w:pPr>
+              <w:spacing w:after="40"/>
+            </w:pPr>
+            <w:r>
+              <w:rPr>
+                <w:sz w:val="19"/>
+              </w:rPr>
+              <w:t>PICK</w:t>
             </w:r>
           </w:p>
         </w:tc>
@@ -2410,7 +2973,7 @@
         <w:spacing w:after="40"/>
       </w:pPr>
       <w:r>
-        <w:t>⚠️ The KSL article doesn't say "4-year-old" photo; say "years-old."</w:t>
+        <w:t>The KSL article doesn't give the photo's age, but the KSL video says "a Reddit post from 4 years ago" (B2, 2:42).</w:t>
       </w:r>
     </w:p>
     <w:p>
@@ -2431,7 +2994,25 @@
         <w:spacing w:after="40"/>
       </w:pPr>
       <w:r>
-        <w:t>Beat 2: "more than 5,000 tire claims in the last nine years" is the host's own claim to KSL. Don't name the host.</w:t>
+        <w:t>Beat 2: "more than 5,000 tire claims" is the host's own boast, in a message to Hope (KSL). Don't name the host. Turo's policy: hosts who submit false claims face up to a $2,000 fee and removal (KSL, 3:10).</w:t>
+      </w:r>
+    </w:p>
+    <w:p>
+      <w:pPr>
+        <w:pStyle w:val="ListBullet"/>
+        <w:spacing w:after="40"/>
+      </w:pPr>
+      <w:r>
+        <w:t>Beat 1: the KSL reporter calls the host "a liar" at 0:45; the cut starts after it.</w:t>
+      </w:r>
+    </w:p>
+    <w:p>
+      <w:pPr>
+        <w:pStyle w:val="ListBullet"/>
+        <w:spacing w:after="40"/>
+      </w:pPr>
+      <w:r>
+        <w:t>Beat 1: she rented the car in Miami (KSL, 0:41).</w:t>
       </w:r>
     </w:p>
     <w:p>
@@ -2466,7 +3047,7 @@
           <w:color w:val="000000"/>
           <w:sz w:val="32"/>
         </w:rPr>
-        <w:t>C. WINTER BILLS ARE GOING UP, AND THIS ONE CALL CAN DOUBLE YOURS</w:t>
+        <w:t>C. WINTER BILLS ARE GOING UP, AND YOU MAY HAVE BEEN SWITCHED TO A SUPPLIER YOU NEVER CHOSE</w:t>
       </w:r>
     </w:p>
     <w:p>
@@ -2477,7 +3058,7 @@
         <w:t>In one sentence:</w:t>
       </w:r>
       <w:r>
-        <w:t xml:space="preserve"> Winter heating bills are rising, and callers claiming to be from your utility's "price protection program" switch you to a supplier charging nearly double.</w:t>
+        <w:t xml:space="preserve"> As winter bills rise, people are being signed up with electric suppliers they never chose, by a forged signature at the door or a "price protection" call, and one line on the bill shows it.</w:t>
       </w:r>
     </w:p>
     <w:p>
@@ -2488,7 +3069,7 @@
         <w:t>Hold back:</w:t>
       </w:r>
       <w:r>
-        <w:t xml:space="preserve"> the "price protection" offer is the trap: saying yes is what doubles your rate.</w:t>
+        <w:t xml:space="preserve"> she never signed anything; someone forged her name.</w:t>
       </w:r>
     </w:p>
     <w:p>
@@ -2499,7 +3080,7 @@
         <w:t>Peg:</w:t>
       </w:r>
       <w:r>
-        <w:t xml:space="preserve"> EIA's winter outlook (Oct 6) says electric-heat homes pay about 4% more and heating-oil homes about 21% more → people are already worried about the bill → a call offering to "lock in" a rate sounds like help. "The bill is real. The program isn't."</w:t>
+        <w:t xml:space="preserve"> EIA's winter outlook (Oct 6) says electric-heat homes pay about 4% more and heating-oil homes about 21% more → people are already worried about the bill → an offer to "lock in" a rate, at the door or on the phone, sounds like help. "The bill is real. The program isn't."</w:t>
       </w:r>
     </w:p>
     <w:p>
@@ -2510,7 +3091,7 @@
         <w:t>Framing:</w:t>
       </w:r>
       <w:r>
-        <w:t xml:space="preserve"> a phone call about your electric bill from someone who says they're with your utility.</w:t>
+        <w:t xml:space="preserve"> someone switches your electric supplier without your OK, at your door or on the phone.</w:t>
       </w:r>
     </w:p>
     <w:p>
@@ -2521,7 +3102,7 @@
         <w:t>Climb:</w:t>
       </w:r>
       <w:r>
-        <w:t xml:space="preserve"> your bill goes up → someone offers to protect you → the protection nearly doubles it.</w:t>
+        <w:t xml:space="preserve"> your bill goes up → a stranger offers to help with it → you find out you've been switched without saying yes.</w:t>
       </w:r>
     </w:p>
     <w:p>
@@ -2532,7 +3113,7 @@
         <w:t>Weight:</w:t>
       </w:r>
       <w:r>
-        <w:t xml:space="preserve"> ~20% of show · 2 clip beats</w:t>
+        <w:t xml:space="preserve"> ~20% of show · 1 clip beat</w:t>
       </w:r>
     </w:p>
     <w:tbl>
@@ -2683,7 +3264,7 @@
               <w:rPr>
                 <w:sz w:val="19"/>
               </w:rPr>
-              <w:t>Electric-heat homes will pay about 4% more this winter and heating-oil homes about 21% more (EIA, Oct 6).</w:t>
+              <w:t>Electric-heat homes pay about 4% more this winter, heating-oil homes about 21% (EIA, Oct 6); Illinois callers pitched "price protection."</w:t>
             </w:r>
           </w:p>
         </w:tc>
@@ -2733,7 +3314,7 @@
               <w:rPr>
                 <w:sz w:val="19"/>
               </w:rPr>
-              <w:t>Her bill nearly tripled</w:t>
+              <w:t>She never signed</w:t>
             </w:r>
           </w:p>
         </w:tc>
@@ -2749,7 +3330,7 @@
               <w:rPr>
                 <w:sz w:val="19"/>
               </w:rPr>
-              <w:t>Manassas, Virginia homeowner, unnamed (Jan 2026)</w:t>
+              <w:t>York County, Pennsylvania woman (Sept 2024)</w:t>
             </w:r>
           </w:p>
         </w:tc>
@@ -2765,7 +3346,7 @@
               <w:rPr>
                 <w:sz w:val="19"/>
               </w:rPr>
-              <w:t>Her January bill jumps from about $100 to $281.</w:t>
+              <w:t>A letter says she's enrolled with an energy supplier she's never heard of; a door-to-door agent forged her signature.</w:t>
             </w:r>
           </w:p>
         </w:tc>
@@ -2781,7 +3362,7 @@
               <w:rPr>
                 <w:sz w:val="19"/>
               </w:rPr>
-              <w:t>FIND · HORIZONTAL — local news on a Manassas or Virginia bill spike</w:t>
+              <w:t>FIND · HORIZONTAL — FOX43 kXnLrmP-Wm8</w:t>
             </w:r>
           </w:p>
         </w:tc>
@@ -2800,88 +3381,6 @@
                 <w:sz w:val="19"/>
               </w:rPr>
               <w:t>3</w:t>
-            </w:r>
-          </w:p>
-        </w:tc>
-        <w:tc>
-          <w:tcPr>
-            <w:tcW w:type="dxa" w:w="1656"/>
-          </w:tcPr>
-          <w:p>
-            <w:pPr>
-              <w:spacing w:after="40"/>
-            </w:pPr>
-            <w:r>
-              <w:rPr>
-                <w:sz w:val="19"/>
-              </w:rPr>
-              <w:t>The call</w:t>
-            </w:r>
-          </w:p>
-        </w:tc>
-        <w:tc>
-          <w:tcPr>
-            <w:tcW w:type="dxa" w:w="2160"/>
-          </w:tcPr>
-          <w:p>
-            <w:pPr>
-              <w:spacing w:after="40"/>
-            </w:pPr>
-            <w:r>
-              <w:rPr>
-                <w:sz w:val="19"/>
-              </w:rPr>
-              <w:t>Unnamed — need a name (Illinois customer, 2026)</w:t>
-            </w:r>
-          </w:p>
-        </w:tc>
-        <w:tc>
-          <w:tcPr>
-            <w:tcW w:type="dxa" w:w="4104"/>
-          </w:tcPr>
-          <w:p>
-            <w:pPr>
-              <w:spacing w:after="40"/>
-            </w:pPr>
-            <w:r>
-              <w:rPr>
-                <w:sz w:val="19"/>
-              </w:rPr>
-              <w:t>A caller claims a utility "price protection program," and the customer is enrolled with Rushmore Energy at nearly double the rate.</w:t>
-            </w:r>
-          </w:p>
-        </w:tc>
-        <w:tc>
-          <w:tcPr>
-            <w:tcW w:type="dxa" w:w="1584"/>
-          </w:tcPr>
-          <w:p>
-            <w:pPr>
-              <w:spacing w:after="40"/>
-            </w:pPr>
-            <w:r>
-              <w:rPr>
-                <w:sz w:val="19"/>
-              </w:rPr>
-              <w:t>FIND · HORIZONTAL — Illinois news on the AG's Rushmore settlement or a switched customer</w:t>
-            </w:r>
-          </w:p>
-        </w:tc>
-      </w:tr>
-      <w:tr>
-        <w:tc>
-          <w:tcPr>
-            <w:tcW w:type="dxa" w:w="432"/>
-          </w:tcPr>
-          <w:p>
-            <w:pPr>
-              <w:spacing w:after="40"/>
-            </w:pPr>
-            <w:r>
-              <w:rPr>
-                <w:sz w:val="19"/>
-              </w:rPr>
-              <w:t>4</w:t>
             </w:r>
           </w:p>
         </w:tc>
@@ -2929,7 +3428,7 @@
               <w:rPr>
                 <w:sz w:val="19"/>
               </w:rPr>
-              <w:t>A real bill on screen: find "supply" or "price to compare," and call your utility if you don't recognize the company.</w:t>
+              <w:t>Find "supply" or "price to compare" on your bill, and call your utility if you don't recognize the company.</w:t>
             </w:r>
           </w:p>
         </w:tc>
@@ -2945,7 +3444,193 @@
               <w:rPr>
                 <w:sz w:val="19"/>
               </w:rPr>
-              <w:t>DEMO</w:t>
+              <w:t>JEFF</w:t>
+            </w:r>
+          </w:p>
+        </w:tc>
+      </w:tr>
+    </w:tbl>
+    <w:p/>
+    <w:p>
+      <w:pPr>
+        <w:pStyle w:val="Heading3"/>
+      </w:pPr>
+      <w:r>
+        <w:rPr>
+          <w:color w:val="333333"/>
+          <w:sz w:val="22"/>
+        </w:rPr>
+        <w:t>Videos</w:t>
+      </w:r>
+    </w:p>
+    <w:tbl>
+      <w:tblPr>
+        <w:tblStyle w:val="TableGrid"/>
+        <w:tblW w:type="auto" w:w="0"/>
+        <w:jc w:val="center"/>
+        <w:tblLayout w:type="fixed"/>
+        <w:tblLook w:firstColumn="1" w:firstRow="1" w:lastColumn="0" w:lastRow="0" w:noHBand="0" w:noVBand="1" w:val="04A0"/>
+      </w:tblPr>
+      <w:tblGrid>
+        <w:gridCol w:w="432"/>
+        <w:gridCol w:w="2664"/>
+        <w:gridCol w:w="3096"/>
+        <w:gridCol w:w="2376"/>
+        <w:gridCol w:w="1368"/>
+      </w:tblGrid>
+      <w:tr>
+        <w:tc>
+          <w:tcPr>
+            <w:tcW w:type="dxa" w:w="432"/>
+          </w:tcPr>
+          <w:p>
+            <w:r>
+              <w:rPr>
+                <w:b/>
+                <w:sz w:val="19"/>
+              </w:rPr>
+              <w:t>#</w:t>
+            </w:r>
+          </w:p>
+        </w:tc>
+        <w:tc>
+          <w:tcPr>
+            <w:tcW w:type="dxa" w:w="2664"/>
+          </w:tcPr>
+          <w:p>
+            <w:r>
+              <w:rPr>
+                <w:b/>
+                <w:sz w:val="19"/>
+              </w:rPr>
+              <w:t>Clip</w:t>
+            </w:r>
+          </w:p>
+        </w:tc>
+        <w:tc>
+          <w:tcPr>
+            <w:tcW w:type="dxa" w:w="3096"/>
+          </w:tcPr>
+          <w:p>
+            <w:r>
+              <w:rPr>
+                <w:b/>
+                <w:sz w:val="19"/>
+              </w:rPr>
+              <w:t>Shows</w:t>
+            </w:r>
+          </w:p>
+        </w:tc>
+        <w:tc>
+          <w:tcPr>
+            <w:tcW w:type="dxa" w:w="2376"/>
+          </w:tcPr>
+          <w:p>
+            <w:r>
+              <w:rPr>
+                <w:b/>
+                <w:sz w:val="19"/>
+              </w:rPr>
+              <w:t>In–Out</w:t>
+            </w:r>
+          </w:p>
+        </w:tc>
+        <w:tc>
+          <w:tcPr>
+            <w:tcW w:type="dxa" w:w="1368"/>
+          </w:tcPr>
+          <w:p>
+            <w:r>
+              <w:rPr>
+                <w:b/>
+                <w:sz w:val="19"/>
+              </w:rPr>
+              <w:t>Status</w:t>
+            </w:r>
+          </w:p>
+        </w:tc>
+      </w:tr>
+      <w:tr>
+        <w:tc>
+          <w:tcPr>
+            <w:tcW w:type="dxa" w:w="432"/>
+          </w:tcPr>
+          <w:p>
+            <w:pPr>
+              <w:spacing w:after="40"/>
+            </w:pPr>
+            <w:r>
+              <w:rPr>
+                <w:sz w:val="19"/>
+              </w:rPr>
+              <w:t>2</w:t>
+            </w:r>
+          </w:p>
+        </w:tc>
+        <w:tc>
+          <w:tcPr>
+            <w:tcW w:type="dxa" w:w="2664"/>
+          </w:tcPr>
+          <w:p>
+            <w:pPr>
+              <w:spacing w:after="40"/>
+            </w:pPr>
+            <w:hyperlink r:id="rId13">
+              <w:r>
+                <w:rPr>
+                  <w:color w:val="1155CC"/>
+                  <w:u w:val="single"/>
+                </w:rPr>
+                <w:t xml:space="preserve">FOX43 — Energy slamming: How you could be signed up for an energy service without approval</w:t>
+              </w:r>
+            </w:hyperlink>
+          </w:p>
+        </w:tc>
+        <w:tc>
+          <w:tcPr>
+            <w:tcW w:type="dxa" w:w="3096"/>
+          </w:tcPr>
+          <w:p>
+            <w:pPr>
+              <w:spacing w:after="40"/>
+            </w:pPr>
+            <w:r>
+              <w:rPr>
+                <w:sz w:val="19"/>
+              </w:rPr>
+              <w:t>The letter she almost threw out, "I've never even heard of them," the forged signature, "slamming" is illegal, and the company says its third-party marketer was fired. Uploaded Sept 10, 2024, 4:41.</w:t>
+            </w:r>
+          </w:p>
+        </w:tc>
+        <w:tc>
+          <w:tcPr>
+            <w:tcW w:type="dxa" w:w="2376"/>
+          </w:tcPr>
+          <w:p>
+            <w:pPr>
+              <w:spacing w:after="40"/>
+            </w:pPr>
+            <w:r>
+              <w:rPr>
+                <w:sz w:val="19"/>
+              </w:rPr>
+              <w:t>0:48–1:29 "never even heard of them" BUTT 1:56–2:04 "and it's illegal" BUTT 3:13–3:29 "has been terminated"</w:t>
+            </w:r>
+          </w:p>
+        </w:tc>
+        <w:tc>
+          <w:tcPr>
+            <w:tcW w:type="dxa" w:w="1368"/>
+          </w:tcPr>
+          <w:p>
+            <w:pPr>
+              <w:spacing w:after="40"/>
+            </w:pPr>
+            <w:r>
+              <w:rPr>
+                <w:sz w:val="19"/>
+              </w:rPr>
+              <w:t>PICK</w:t>
             </w:r>
           </w:p>
         </w:tc>
@@ -2970,7 +3655,7 @@
         <w:spacing w:after="40"/>
       </w:pPr>
       <w:r>
-        <w:t>After the homeowner: a bill that jumps with no change in use. Check who your supplier is before anything else.</w:t>
+        <w:t>After the woman in York County: a letter from an energy company you don't know isn't junk. Open it.</w:t>
       </w:r>
     </w:p>
     <w:p>
@@ -2979,7 +3664,7 @@
         <w:spacing w:after="40"/>
       </w:pPr>
       <w:r>
-        <w:t>After the call: your utility won't call to "lock" your rate. Hang up and call the number on your bill.</w:t>
+        <w:t>Your utility won't call or knock to "lock" your rate. Close the door or hang up, and call the number on your bill. ⚠️ source (your utility's scam page)</w:t>
       </w:r>
     </w:p>
     <w:p>
@@ -2997,7 +3682,16 @@
         <w:spacing w:after="40"/>
       </w:pPr>
       <w:r>
-        <w:t>Never give your account number to a caller (Illinois Attorney General, Rushmore Energy settlement, 6/4/2026). ⚠️ confirm the AG's page says it</w:t>
+        <w:t>Switched without your OK? File a complaint with your state utility commission (Pennsylvania PUC, per WPXI and FOX43). ⚠️ confirm on the PUC page</w:t>
+      </w:r>
+    </w:p>
+    <w:p>
+      <w:pPr>
+        <w:pStyle w:val="ListBullet"/>
+        <w:spacing w:after="40"/>
+      </w:pPr>
+      <w:r>
+        <w:t>Never give your account number to a caller or a door-to-door agent (Illinois Attorney General, Rushmore Energy settlement, 6/4/2026). ⚠️ confirm the AG's page says it</w:t>
       </w:r>
     </w:p>
     <w:p>
@@ -3024,7 +3718,7 @@
         <w:spacing w:after="40"/>
       </w:pPr>
       <w:r>
-        <w:t>Do-nothing test: if you were already switched, doing nothing keeps you on the higher rate. Call your utility to switch back, and ask about cancellation fees. ⚠️ source</w:t>
+        <w:t>Do-nothing test: if you were already switched, doing nothing keeps you on their rate. Call your utility to switch back, and ask about cancellation fees. ⚠️ source</w:t>
       </w:r>
     </w:p>
     <w:p>
@@ -3045,7 +3739,7 @@
         <w:spacing w:after="40"/>
       </w:pPr>
       <w:r>
-        <w:t>⚠️ No 55+ victim and no clip of the call. Beat 3 may end up a news clip about the settlement, not a person.</w:t>
+        <w:t>⚠️ C2 York County woman is Sept 2024: date it on air ("a couple of years ago").</w:t>
       </w:r>
     </w:p>
     <w:p>
@@ -3054,7 +3748,7 @@
         <w:spacing w:after="40"/>
       </w:pPr>
       <w:r>
-        <w:t>⚠️ C2 Manassas bill is January 2026 (Consumer Reports, March): date it on air ("last January").</w:t>
+        <w:t>⚠️ Her name is garbled in the auto-captions; get it from FOX43's article before the bible.</w:t>
       </w:r>
     </w:p>
     <w:p>
@@ -3084,7 +3778,16 @@
         <w:spacing w:after="40"/>
       </w:pPr>
       <w:r>
-        <w:t>Beat 3: the Rushmore matter is a settlement of the Illinois AG's allegations; "nearly double" is the AG's wording. ⚠️ Check whether Rushmore admitted anything.</w:t>
+        <w:t>Beat 2: the supplier in the FOX43 story is Indra Energy (licensed under Palmco); Indra said it couldn't tell how its door-to-door marketer got her information and fired the marketer. Pennsylvania's PUC was investigating. Don't name the company on air unless the room wants to.</w:t>
+      </w:r>
+    </w:p>
+    <w:p>
+      <w:pPr>
+        <w:pStyle w:val="ListBullet"/>
+        <w:spacing w:after="40"/>
+      </w:pPr>
+      <w:r>
+        <w:t>Beat 1: the Rushmore matter is a settlement of the Illinois AG's allegations; "nearly double" is the AG's wording. ⚠️ Check whether Rushmore admitted anything.</w:t>
       </w:r>
     </w:p>
     <w:p>
@@ -3102,7 +3805,7 @@
         <w:spacing w:after="40"/>
       </w:pPr>
       <w:r>
-        <w:t>Beat 4: in states without supplier choice there's no supply company to switch, and a call like this is a scam outright.</w:t>
+        <w:t>Beat 3: in states without supplier choice there's no supply company to switch, and a call like this is a scam outright.</w:t>
       </w:r>
     </w:p>
     <w:sectPr>

</xml_diff>

<commit_message>
10/21 F2: B reworked per producer (rental cars, not Turo; Hertz AI scanner leads; walkaround payoff); Google Doc edited in place
Co-Authored-By: Claude Opus 5.5 <noreply@anthropic.com>
Claude-Session: https://claude.ai/code/session_01VmRatYBunsoj9i1F4m2msf
</commit_message>
<xml_diff>
--- a/runs/W_10212026/10_21_OUTLINE_WED.docx
+++ b/runs/W_10212026/10_21_OUTLINE_WED.docx
@@ -403,7 +403,7 @@
               <w:rPr>
                 <w:sz w:val="19"/>
               </w:rPr>
-              <w:t>2/2</w:t>
+              <w:t>3/3</w:t>
             </w:r>
           </w:p>
         </w:tc>
@@ -633,7 +633,7 @@
     </w:p>
     <w:p>
       <w:r>
-        <w:t>Your smart TV checks what's on its screen and sells the pattern to advertisers, it's on by default, and only people in Texas were ever asked. A separate investigation says LG sets can record audio in standby, which LG denies, so we keep that claim separate and lean on what's proven: the tracking, and how to turn it off where your TV lets you. Then a rental host bills a renter for a tire with a photo of a different car, and as winter bills rise, a Pennsylvania woman finds she's been signed up with an electric supplier she never heard of.</w:t>
+        <w:t>Your smart TV checks what's on its screen and sells the pattern to advertisers, it's on by default, and only people in Texas were ever asked. A separate investigation says LG sets can record audio in standby, which LG denies, so we keep that claim separate and lean on what's proven: the tracking, and how to turn it off where your TV lets you. Then rental car customers get damage bills after they return the car, from Hertz's AI scanner to an owner who faked a tire photo, and as winter bills rise, a Pennsylvania woman finds she's been signed up with an electric supplier she never heard of.</w:t>
       </w:r>
     </w:p>
     <w:p>
@@ -650,7 +650,7 @@
     </w:p>
     <w:p>
       <w:r>
-        <w:t>A climbs from your screen to the ad companies to the claim about your living room, then exhales on a fix walked through by Lon. B is a quick outrage with a satisfying catch: she proved the photo was fake. C starts with a bill everyone dreads and ends on one line to check tonight, so the show exhales twice.</w:t>
+        <w:t>A climbs from your screen to the ad companies to the claim about your living room, then exhales on a fix walked through by Lon. B climbs from a machine billing for dents you can't see to a faked photo, with a satisfying catch: she proved it was fake. C starts with a bill everyone dreads and ends on one line to check tonight, so the show exhales twice.</w:t>
       </w:r>
     </w:p>
     <w:p>
@@ -734,7 +734,7 @@
         <w:spacing w:after="40"/>
       </w:pPr>
       <w:r>
-        <w:t>B: no 55+ victim, and Hope was refunded, so there's no real-loss case to lead with. It plays as a warning with a fix.</w:t>
+        <w:t>B reworked (producer, 10/14): rental cars in general, not Turo; Hertz's AI scanner (CBS) leads as the legacy company, then Hope's fake tire photo; the payoff is a video walkaround before you return the car (reverse image search dropped); the Birmingham Turo case is cut. No 55+ victim, and both renters got their money back, so it plays as a warning with a fix.</w:t>
       </w:r>
     </w:p>
     <w:p>
@@ -770,7 +770,7 @@
         <w:spacing w:after="40"/>
       </w:pPr>
       <w:r>
-        <w:t>Picks: 6/6 verified against YouTube captions (rung 1). Source mix: affiliate 3 · creator_long 3.</w:t>
+        <w:t>Picks: 7/7 verified against YouTube captions (rung 1). Source mix: affiliate 3 · creator_long 3 · network 1.</w:t>
       </w:r>
     </w:p>
     <w:p>
@@ -2134,7 +2134,7 @@
         <w:t>In one sentence:</w:t>
       </w:r>
       <w:r>
-        <w:t xml:space="preserve"> A Turo host billed a Utah renter for smoking and a ruined tire, she proved his tire photo was an old picture of a different car, and it's not the only case.</w:t>
+        <w:t xml:space="preserve"> Rental car customers are getting damage bills after they return the car, from an AI scanner at Hertz to an owner who faked a tire photo, and a video walkaround is your proof.</w:t>
       </w:r>
     </w:p>
     <w:p>
@@ -2156,7 +2156,7 @@
         <w:t>Peg:</w:t>
       </w:r>
       <w:r>
-        <w:t xml:space="preserve"> KSL's report (Oct 5) is doing 547K in five days, and holiday travel is weeks out (AAA: 81.8M Thanksgiving travelers in 2025). "Your phone is your alibi."</w:t>
+        <w:t xml:space="preserve"> KSL's report (Oct 5) is doing 600K in a week, and holiday travel is weeks out (AAA: 81.8M Thanksgiving travelers in 2025). "Your phone is your alibi."</w:t>
       </w:r>
     </w:p>
     <w:p>
@@ -2167,7 +2167,7 @@
         <w:t>Framing:</w:t>
       </w:r>
       <w:r>
-        <w:t xml:space="preserve"> a damage bill that shows up after you've returned the car.</w:t>
+        <w:t xml:space="preserve"> a damage bill that shows up after you've returned the rental car.</w:t>
       </w:r>
     </w:p>
     <w:p>
@@ -2178,7 +2178,7 @@
         <w:t>Climb:</w:t>
       </w:r>
       <w:r>
-        <w:t xml:space="preserve"> a charge you can't argue with → the proof is fake → the host says he's filed thousands of tire claims, and it's happening elsewhere.</w:t>
+        <w:t xml:space="preserve"> a machine bills you for dents you can't even see → someone fakes the damage outright → you prove it with your own video.</w:t>
       </w:r>
     </w:p>
     <w:p>
@@ -2189,7 +2189,7 @@
         <w:t>Weight:</w:t>
       </w:r>
       <w:r>
-        <w:t xml:space="preserve"> ~25% of show · 2 clip beats</w:t>
+        <w:t xml:space="preserve"> ~25% of show · 3 clip beats</w:t>
       </w:r>
     </w:p>
     <w:tbl>
@@ -2308,6 +2308,88 @@
               <w:rPr>
                 <w:sz w:val="19"/>
               </w:rPr>
+              <w:t>The scanner</w:t>
+            </w:r>
+          </w:p>
+        </w:tc>
+        <w:tc>
+          <w:tcPr>
+            <w:tcW w:type="dxa" w:w="2160"/>
+          </w:tcPr>
+          <w:p>
+            <w:pPr>
+              <w:spacing w:after="40"/>
+            </w:pPr>
+            <w:r>
+              <w:rPr>
+                <w:sz w:val="19"/>
+              </w:rPr>
+              <w:t>Adam Foley, San Antonio, Texas (Aug 2025)</w:t>
+            </w:r>
+          </w:p>
+        </w:tc>
+        <w:tc>
+          <w:tcPr>
+            <w:tcW w:type="dxa" w:w="4104"/>
+          </w:tcPr>
+          <w:p>
+            <w:pPr>
+              <w:spacing w:after="40"/>
+            </w:pPr>
+            <w:r>
+              <w:rPr>
+                <w:sz w:val="19"/>
+              </w:rPr>
+              <w:t>Hertz's AI scanner bills him $350 for two small dents he never noticed; Hertz waives it after CBS asks.</w:t>
+            </w:r>
+          </w:p>
+        </w:tc>
+        <w:tc>
+          <w:tcPr>
+            <w:tcW w:type="dxa" w:w="1584"/>
+          </w:tcPr>
+          <w:p>
+            <w:pPr>
+              <w:spacing w:after="40"/>
+            </w:pPr>
+            <w:r>
+              <w:rPr>
+                <w:sz w:val="19"/>
+              </w:rPr>
+              <w:t>HAVE · HORIZONTAL — CBS Evening News 0ANywiehCCA</w:t>
+            </w:r>
+          </w:p>
+        </w:tc>
+      </w:tr>
+      <w:tr>
+        <w:tc>
+          <w:tcPr>
+            <w:tcW w:type="dxa" w:w="432"/>
+          </w:tcPr>
+          <w:p>
+            <w:pPr>
+              <w:spacing w:after="40"/>
+            </w:pPr>
+            <w:r>
+              <w:rPr>
+                <w:sz w:val="19"/>
+              </w:rPr>
+              <w:t>2</w:t>
+            </w:r>
+          </w:p>
+        </w:tc>
+        <w:tc>
+          <w:tcPr>
+            <w:tcW w:type="dxa" w:w="1656"/>
+          </w:tcPr>
+          <w:p>
+            <w:pPr>
+              <w:spacing w:after="40"/>
+            </w:pPr>
+            <w:r>
+              <w:rPr>
+                <w:sz w:val="19"/>
+              </w:rPr>
               <w:t>The bill</w:t>
             </w:r>
           </w:p>
@@ -2340,7 +2422,7 @@
               <w:rPr>
                 <w:sz w:val="19"/>
               </w:rPr>
-              <w:t>After returning a Turo rental she's billed $165 for smoking, and Turo warns a $500 tire charge is coming.</w:t>
+              <w:t>After she returns a rental car, the owner bills $165 for smoking and a $500 tire charge is coming.</w:t>
             </w:r>
           </w:p>
         </w:tc>
@@ -2374,7 +2456,7 @@
               <w:rPr>
                 <w:sz w:val="19"/>
               </w:rPr>
-              <w:t>2</w:t>
+              <w:t>3</w:t>
             </w:r>
           </w:p>
         </w:tc>
@@ -2422,7 +2504,7 @@
               <w:rPr>
                 <w:sz w:val="19"/>
               </w:rPr>
-              <w:t>A reverse image search finds the tire photo on Reddit, years old, a different car; Turo bans the host and refunds her.</w:t>
+              <w:t>Her own photos show a different tire tread, and the "proof" turns out to be a years-old Reddit picture; the charges are dropped.</w:t>
             </w:r>
           </w:p>
         </w:tc>
@@ -2439,88 +2521,6 @@
                 <w:sz w:val="19"/>
               </w:rPr>
               <w:t>HAVE · HORIZONTAL — KSL, same clip (second segment)</w:t>
-            </w:r>
-          </w:p>
-        </w:tc>
-      </w:tr>
-      <w:tr>
-        <w:tc>
-          <w:tcPr>
-            <w:tcW w:type="dxa" w:w="432"/>
-          </w:tcPr>
-          <w:p>
-            <w:pPr>
-              <w:spacing w:after="40"/>
-            </w:pPr>
-            <w:r>
-              <w:rPr>
-                <w:sz w:val="19"/>
-              </w:rPr>
-              <w:t>3</w:t>
-            </w:r>
-          </w:p>
-        </w:tc>
-        <w:tc>
-          <w:tcPr>
-            <w:tcW w:type="dxa" w:w="1656"/>
-          </w:tcPr>
-          <w:p>
-            <w:pPr>
-              <w:spacing w:after="40"/>
-            </w:pPr>
-            <w:r>
-              <w:rPr>
-                <w:sz w:val="19"/>
-              </w:rPr>
-              <w:t>It's not just one host</w:t>
-            </w:r>
-          </w:p>
-        </w:tc>
-        <w:tc>
-          <w:tcPr>
-            <w:tcW w:type="dxa" w:w="2160"/>
-          </w:tcPr>
-          <w:p>
-            <w:pPr>
-              <w:spacing w:after="40"/>
-            </w:pPr>
-            <w:r>
-              <w:rPr>
-                <w:sz w:val="19"/>
-              </w:rPr>
-              <w:t>Georgina Montalvan, Birmingham (July 2026)</w:t>
-            </w:r>
-          </w:p>
-        </w:tc>
-        <w:tc>
-          <w:tcPr>
-            <w:tcW w:type="dxa" w:w="4104"/>
-          </w:tcPr>
-          <w:p>
-            <w:pPr>
-              <w:spacing w:after="40"/>
-            </w:pPr>
-            <w:r>
-              <w:rPr>
-                <w:sz w:val="19"/>
-              </w:rPr>
-              <w:t>She's billed $2,338 for damage her own pickup photos show was already there, and refunded after a columnist steps in.</w:t>
-            </w:r>
-          </w:p>
-        </w:tc>
-        <w:tc>
-          <w:tcPr>
-            <w:tcW w:type="dxa" w:w="1584"/>
-          </w:tcPr>
-          <w:p>
-            <w:pPr>
-              <w:spacing w:after="40"/>
-            </w:pPr>
-            <w:r>
-              <w:rPr>
-                <w:sz w:val="19"/>
-              </w:rPr>
-              <w:t>JEFF</w:t>
             </w:r>
           </w:p>
         </w:tc>
@@ -2586,7 +2586,7 @@
               <w:rPr>
                 <w:sz w:val="19"/>
               </w:rPr>
-              <w:t>Before you drive off, film a slow walkaround, tires and interior; if they send a damage photo, reverse-image-search it.</w:t>
+              <w:t>Before you hand back the keys, film a slow walkaround of the car, tires and interior.</w:t>
             </w:r>
           </w:p>
         </w:tc>
@@ -2739,6 +2739,91 @@
                   <w:color w:val="1155CC"/>
                   <w:u w:val="single"/>
                 </w:rPr>
+                <w:t xml:space="preserve">CBS Evening News — Behind the controversial AI tech used to inspect rental vehicles for damages</w:t>
+              </w:r>
+            </w:hyperlink>
+          </w:p>
+        </w:tc>
+        <w:tc>
+          <w:tcPr>
+            <w:tcW w:type="dxa" w:w="3096"/>
+          </w:tcPr>
+          <w:p>
+            <w:pPr>
+              <w:spacing w:after="40"/>
+            </w:pPr>
+            <w:r>
+              <w:rPr>
+                <w:sz w:val="19"/>
+              </w:rPr>
+              <w:t>AI photo booths scan returned cars; Adam Foley billed $80 for two small dents plus a $190 processing fee, $350 total; Hertz's statement (97% showed no billable damage); Hertz waives his fees after CBS asks. Uploaded Aug 27, 2025, 2:54, 275K views.</w:t>
+            </w:r>
+          </w:p>
+        </w:tc>
+        <w:tc>
+          <w:tcPr>
+            <w:tcW w:type="dxa" w:w="2376"/>
+          </w:tcPr>
+          <w:p>
+            <w:pPr>
+              <w:spacing w:after="40"/>
+            </w:pPr>
+            <w:r>
+              <w:rPr>
+                <w:sz w:val="19"/>
+              </w:rPr>
+              <w:t>0:19–1:03 "that I didn't even detect" BUTT 1:35–1:50 "showed no billable damage" BUTT 2:23–2:28 "waved the $350"</w:t>
+            </w:r>
+          </w:p>
+        </w:tc>
+        <w:tc>
+          <w:tcPr>
+            <w:tcW w:type="dxa" w:w="1368"/>
+          </w:tcPr>
+          <w:p>
+            <w:pPr>
+              <w:spacing w:after="40"/>
+            </w:pPr>
+            <w:r>
+              <w:rPr>
+                <w:sz w:val="19"/>
+              </w:rPr>
+              <w:t>PICK</w:t>
+            </w:r>
+          </w:p>
+        </w:tc>
+      </w:tr>
+      <w:tr>
+        <w:tc>
+          <w:tcPr>
+            <w:tcW w:type="dxa" w:w="432"/>
+          </w:tcPr>
+          <w:p>
+            <w:pPr>
+              <w:spacing w:after="40"/>
+            </w:pPr>
+            <w:r>
+              <w:rPr>
+                <w:sz w:val="19"/>
+              </w:rPr>
+              <w:t>2</w:t>
+            </w:r>
+          </w:p>
+        </w:tc>
+        <w:tc>
+          <w:tcPr>
+            <w:tcW w:type="dxa" w:w="2664"/>
+          </w:tcPr>
+          <w:p>
+            <w:pPr>
+              <w:spacing w:after="40"/>
+            </w:pPr>
+            <w:hyperlink r:id="rId13">
+              <w:r>
+                <w:rPr>
+                  <w:color w:val="1155CC"/>
+                  <w:u w:val="single"/>
+                </w:rPr>
                 <w:t xml:space="preserve">KSL Get Gephardt — Car rental service attempts to scam Utah woman out of hundreds</w:t>
               </w:r>
             </w:hyperlink>
@@ -2756,7 +2841,7 @@
               <w:rPr>
                 <w:sz w:val="19"/>
               </w:rPr>
-              <w:t>Hope Orr: a claim for a nail in the tire and smoking ("I don't smoke"), the host's evidence photos, Turo posts a $500 charge. Uploaded Oct 6, 2026, 4:35, 609K views.</w:t>
+              <w:t>Hope Orr: a claim for a nail in the tire and smoking ("I don't smoke"), the owner's evidence photos, a $500 charge posted. Uploaded Oct 6, 2026, 4:35, 609K views.</w:t>
             </w:r>
           </w:p>
         </w:tc>
@@ -2806,7 +2891,7 @@
               <w:rPr>
                 <w:sz w:val="19"/>
               </w:rPr>
-              <w:t>2</w:t>
+              <w:t>3</w:t>
             </w:r>
           </w:p>
         </w:tc>
@@ -2818,7 +2903,7 @@
             <w:pPr>
               <w:spacing w:after="40"/>
             </w:pPr>
-            <w:hyperlink r:id="rId12">
+            <w:hyperlink r:id="rId13">
               <w:r>
                 <w:rPr>
                   <w:color w:val="1155CC"/>
@@ -2841,7 +2926,7 @@
               <w:rPr>
                 <w:sz w:val="19"/>
               </w:rPr>
-              <w:t>The host's "I've done more than 5,000 tire claims," the mismatched tread, Turo sides with the host, then the reverse image search finds the photo in a Reddit post "from 4 years ago" and Turo drops the claims.</w:t>
+              <w:t>The owner's "I've done more than 5,000 tire claims," the mismatched tread, the claim upheld, then the photo found in a Reddit post "from 4 years ago" and the claims removed.</w:t>
             </w:r>
           </w:p>
         </w:tc>
@@ -2898,7 +2983,7 @@
         <w:spacing w:after="40"/>
       </w:pPr>
       <w:r>
-        <w:t>After Hope: a damage photo you can't match to your car. Run it through a reverse image search (Google Lens) before you pay. ⚠️ source</w:t>
+        <w:t>After Adam: a damage bill by text after you've left, for something you never saw. Ask for the before-and-after photos and an itemized estimate before you pay. ⚠ source</w:t>
       </w:r>
     </w:p>
     <w:p>
@@ -2907,7 +2992,7 @@
         <w:spacing w:after="40"/>
       </w:pPr>
       <w:r>
-        <w:t>After Georgina: a bill that arrives days later with no itemized estimate. Ask for one in writing.</w:t>
+        <w:t>After Hope: a damage photo that doesn't match your own. Your video is the proof; send it.</w:t>
       </w:r>
     </w:p>
     <w:p>
@@ -2916,7 +3001,7 @@
         <w:spacing w:after="40"/>
       </w:pPr>
       <w:r>
-        <w:t>Video walkaround of the car, tires and interior at pickup and at drop-off, with the timestamp on. ⚠️ source (Turo trip-photo policy, turo.com)</w:t>
+        <w:t>The payoff: a slow video walkaround of the car, tires and interior before you return it, and at pickup too. Spend the five to ten minutes (KSL Get Gephardt, 4:01).</w:t>
       </w:r>
     </w:p>
     <w:p>
@@ -2925,16 +3010,7 @@
         <w:spacing w:after="40"/>
       </w:pPr>
       <w:r>
-        <w:t>Dispute through the platform, never "settle direct" with a host. ⚠️ source (Turo help pages)</w:t>
-      </w:r>
-    </w:p>
-    <w:p>
-      <w:pPr>
-        <w:pStyle w:val="ListBullet"/>
-        <w:spacing w:after="40"/>
-      </w:pPr>
-      <w:r>
-        <w:t>Still charged? Dispute it with your card company. ⚠️ source (CFPB)</w:t>
+        <w:t>Still charged? Dispute it with your card company. ⚠ source (CFPB)</w:t>
       </w:r>
     </w:p>
     <w:p>
@@ -2955,7 +3031,7 @@
         <w:spacing w:after="40"/>
       </w:pPr>
       <w:r>
-        <w:t>⚠️ Both renters were refunded and neither is confirmed 55+. No real-loss case.</w:t>
+        <w:t>⚠ B1 Adam Foley is Aug 2025: date it on air ("last summer"). ⚠ Check where Hertz's AI scanners stand now (it was at 10 US airports and "still refining"; Sen. Blumenthal was writing to Hertz's CEO).</w:t>
       </w:r>
     </w:p>
     <w:p>
@@ -2964,7 +3040,7 @@
         <w:spacing w:after="40"/>
       </w:pPr>
       <w:r>
-        <w:t>⚠️ Beat 3 is print only (Elliott Report / Boston Globe); no video expected.</w:t>
+        <w:t>⚠ Hope was refunded and neither renter is confirmed 55+. No real-loss case.</w:t>
       </w:r>
     </w:p>
     <w:p>
@@ -2973,7 +3049,7 @@
         <w:spacing w:after="40"/>
       </w:pPr>
       <w:r>
-        <w:t>The KSL article doesn't give the photo's age, but the KSL video says "a Reddit post from 4 years ago" (B2, 2:42).</w:t>
+        <w:t>The KSL article doesn't give the photo's age, but the KSL video says "a Reddit post from 4 years ago" (B3, 2:42).</w:t>
       </w:r>
     </w:p>
     <w:p>
@@ -2994,7 +3070,7 @@
         <w:spacing w:after="40"/>
       </w:pPr>
       <w:r>
-        <w:t>Beat 2: "more than 5,000 tire claims" is the host's own boast, in a message to Hope (KSL). Don't name the host. Turo's policy: hosts who submit false claims face up to a $2,000 fee and removal (KSL, 3:10).</w:t>
+        <w:t>Rental cars in general, not Turo (producer, 10/14): our audience doesn't use the Turo app. Hope rented through Turo, a peer-to-peer app, from a private owner, so say "she rented a car" and "the owner," not "a rental company." The KSL clip still names Turo on screen.</w:t>
       </w:r>
     </w:p>
     <w:p>
@@ -3003,7 +3079,7 @@
         <w:spacing w:after="40"/>
       </w:pPr>
       <w:r>
-        <w:t>Beat 1: the KSL reporter calls the host "a liar" at 0:45; the cut starts after it.</w:t>
+        <w:t>Beat 1: "more than 97% showed no billable damage" is Hertz's own figure. Hertz declined CBS's interview and said the system offers "precision and objectivity."</w:t>
       </w:r>
     </w:p>
     <w:p>
@@ -3012,7 +3088,7 @@
         <w:spacing w:after="40"/>
       </w:pPr>
       <w:r>
-        <w:t>Beat 1: she rented the car in Miami (KSL, 0:41).</w:t>
+        <w:t>Beat 3: "more than 5,000 tire claims" is the owner's own boast, in a message to Hope (KSL). Don't name him. Turo's policy: hosts who submit false claims face up to a $2,000 fee and removal (KSL, 3:10).</w:t>
       </w:r>
     </w:p>
     <w:p>
@@ -3021,7 +3097,25 @@
         <w:spacing w:after="40"/>
       </w:pPr>
       <w:r>
-        <w:t>Beat 3: Montalvan's rental company isn't confirmed as Turo; keep it "a renter in Birmingham."</w:t>
+        <w:t>Beat 2: the KSL reporter calls the owner "a liar" at 0:45; the cut starts after it. She rented the car in Miami (KSL, 0:41).</w:t>
+      </w:r>
+    </w:p>
+    <w:p>
+      <w:pPr>
+        <w:pStyle w:val="ListBullet"/>
+        <w:spacing w:after="40"/>
+      </w:pPr>
+      <w:r>
+        <w:t>Reverse image search is out as viewer advice (producer, 10/14): it stays only as how Hope caught him.</w:t>
+      </w:r>
+    </w:p>
+    <w:p>
+      <w:pPr>
+        <w:pStyle w:val="ListBullet"/>
+        <w:spacing w:after="40"/>
+      </w:pPr>
+      <w:r>
+        <w:t>The Birmingham Turo renter (Georgina Montalvan, $2,338, July 2026) is cut: a Turo case, print only.</w:t>
       </w:r>
     </w:p>
     <w:p>
@@ -3575,7 +3669,7 @@
             <w:pPr>
               <w:spacing w:after="40"/>
             </w:pPr>
-            <w:hyperlink r:id="rId13">
+            <w:hyperlink r:id="rId14">
               <w:r>
                 <w:rPr>
                   <w:color w:val="1155CC"/>

</xml_diff>